<commit_message>
Add Save & Resume + Read-Only View sections to V4 impl plan
Companies cannot complete OrgSetup in one session — it spans
multiple stakeholders over days/weeks. Added two new sections:

Section 18: Save & Resume — auto-save on field blur, explicit
save button with timestamps, block completion states (not started,
in progress, complete, locked), localStorage schema with per-block
status tracking.

Section 19: Saved Block View — when reopened, blocks show saved
data in read-only summary format (not empty forms). Three edit
levels: single-field inline edit, section edit, full block edit.
Includes wireframe examples for Org Identity, Skills Dictionary,
and Hierarchy blocks. Covers incomplete block handling ("Continue
Setup" to first unfilled field) and multi-stakeholder workflow
with per-block ownership and activity tracking.

Co-Authored-By: Claude Opus 4.6 (1M context) <noreply@anthropic.com>
</commit_message>
<xml_diff>
--- a/Project Documents/implementationplanofOrgSetupBlockV3.docx
+++ b/Project Documents/implementationplanofOrgSetupBlockV3.docx
@@ -15995,6 +15995,1942 @@
           <w:sz w:val="19"/>
         </w:rPr>
         <w:t>Estimated: Low-medium complexity. Primarily visualisation and state management.</w:t>
+      </w:r>
+    </w:p>
+    <w:p>
+      <w:r>
+        <w:br w:type="page"/>
+      </w:r>
+    </w:p>
+    <w:p>
+      <w:pPr>
+        <w:pStyle w:val="Heading1"/>
+      </w:pPr>
+      <w:r>
+        <w:t>18. Save &amp; Resume — Incremental Completion Model</w:t>
+      </w:r>
+    </w:p>
+    <w:p>
+      <w:r>
+        <w:t>Companies cannot complete OrgSetup in a single session. The onboarding process involves multiple stakeholders (HR, department heads, SMEs, leadership), requires gathering data from various systems (HRIS, strategy docs, compliance records), and spans days or weeks. The platform must support incremental completion with persistent state, so users can save progress at any point and resume exactly where they left off.</w:t>
+      </w:r>
+    </w:p>
+    <w:p>
+      <w:pPr>
+        <w:pStyle w:val="Heading2"/>
+      </w:pPr>
+      <w:r>
+        <w:t>18.1 Auto-Save Behaviour</w:t>
+      </w:r>
+    </w:p>
+    <w:p>
+      <w:r>
+        <w:t>Every field change, list item addition, or configuration change is auto-saved to localStorage immediately. There is no "Save" button that users must remember to click — data is never lost due to forgetting to save. However, a visible "Save" button is provided for user confidence and to trigger a deliberate checkpoint.</w:t>
+      </w:r>
+    </w:p>
+    <w:tbl>
+      <w:tblPr>
+        <w:tblStyle w:val="TableGrid"/>
+        <w:tblW w:type="auto" w:w="0"/>
+        <w:jc w:val="left"/>
+        <w:tblLook w:firstColumn="1" w:firstRow="1" w:lastColumn="0" w:lastRow="0" w:noHBand="0" w:noVBand="1" w:val="04A0"/>
+      </w:tblPr>
+      <w:tblGrid>
+        <w:gridCol w:w="3135"/>
+        <w:gridCol w:w="3135"/>
+        <w:gridCol w:w="3135"/>
+      </w:tblGrid>
+      <w:tr>
+        <w:tc>
+          <w:tcPr>
+            <w:tcW w:type="dxa" w:w="2268"/>
+            <w:shd w:fill="6366F1" w:val="clear"/>
+          </w:tcPr>
+          <w:p>
+            <w:pPr>
+              <w:jc w:val="left"/>
+            </w:pPr>
+            <w:r>
+              <w:rPr>
+                <w:b/>
+                <w:color w:val="FFFFFF"/>
+                <w:sz w:val="19"/>
+              </w:rPr>
+              <w:t>Trigger</w:t>
+            </w:r>
+          </w:p>
+        </w:tc>
+        <w:tc>
+          <w:tcPr>
+            <w:tcW w:type="dxa" w:w="2835"/>
+            <w:shd w:fill="6366F1" w:val="clear"/>
+          </w:tcPr>
+          <w:p>
+            <w:pPr>
+              <w:jc w:val="left"/>
+            </w:pPr>
+            <w:r>
+              <w:rPr>
+                <w:b/>
+                <w:color w:val="FFFFFF"/>
+                <w:sz w:val="19"/>
+              </w:rPr>
+              <w:t>What Happens</w:t>
+            </w:r>
+          </w:p>
+        </w:tc>
+        <w:tc>
+          <w:tcPr>
+            <w:tcW w:type="dxa" w:w="2835"/>
+            <w:shd w:fill="6366F1" w:val="clear"/>
+          </w:tcPr>
+          <w:p>
+            <w:pPr>
+              <w:jc w:val="left"/>
+            </w:pPr>
+            <w:r>
+              <w:rPr>
+                <w:b/>
+                <w:color w:val="FFFFFF"/>
+                <w:sz w:val="19"/>
+              </w:rPr>
+              <w:t>Visual Feedback</w:t>
+            </w:r>
+          </w:p>
+        </w:tc>
+      </w:tr>
+      <w:tr>
+        <w:tc>
+          <w:tcPr>
+            <w:tcW w:type="dxa" w:w="2268"/>
+          </w:tcPr>
+          <w:p>
+            <w:r>
+              <w:rPr>
+                <w:sz w:val="19"/>
+              </w:rPr>
+              <w:t>Field blur (user tabs/clicks away from a field)</w:t>
+            </w:r>
+          </w:p>
+        </w:tc>
+        <w:tc>
+          <w:tcPr>
+            <w:tcW w:type="dxa" w:w="2835"/>
+          </w:tcPr>
+          <w:p>
+            <w:r>
+              <w:rPr>
+                <w:sz w:val="19"/>
+              </w:rPr>
+              <w:t>Field value saved to localStorage block data</w:t>
+            </w:r>
+          </w:p>
+        </w:tc>
+        <w:tc>
+          <w:tcPr>
+            <w:tcW w:type="dxa" w:w="2835"/>
+          </w:tcPr>
+          <w:p>
+            <w:r>
+              <w:rPr>
+                <w:sz w:val="19"/>
+              </w:rPr>
+              <w:t>Subtle "Saved" micro-animation next to field (checkmark that fades)</w:t>
+            </w:r>
+          </w:p>
+        </w:tc>
+      </w:tr>
+      <w:tr>
+        <w:tc>
+          <w:tcPr>
+            <w:tcW w:type="dxa" w:w="2268"/>
+            <w:shd w:fill="F1F3F6" w:val="clear"/>
+          </w:tcPr>
+          <w:p>
+            <w:r>
+              <w:rPr>
+                <w:sz w:val="19"/>
+              </w:rPr>
+              <w:t>List item added/removed</w:t>
+            </w:r>
+          </w:p>
+        </w:tc>
+        <w:tc>
+          <w:tcPr>
+            <w:tcW w:type="dxa" w:w="2835"/>
+            <w:shd w:fill="F1F3F6" w:val="clear"/>
+          </w:tcPr>
+          <w:p>
+            <w:r>
+              <w:rPr>
+                <w:sz w:val="19"/>
+              </w:rPr>
+              <w:t>Full list saved to localStorage</w:t>
+            </w:r>
+          </w:p>
+        </w:tc>
+        <w:tc>
+          <w:tcPr>
+            <w:tcW w:type="dxa" w:w="2835"/>
+            <w:shd w:fill="F1F3F6" w:val="clear"/>
+          </w:tcPr>
+          <w:p>
+            <w:r>
+              <w:rPr>
+                <w:sz w:val="19"/>
+              </w:rPr>
+              <w:t>Toast: "Item added" / "Item removed"</w:t>
+            </w:r>
+          </w:p>
+        </w:tc>
+      </w:tr>
+      <w:tr>
+        <w:tc>
+          <w:tcPr>
+            <w:tcW w:type="dxa" w:w="2268"/>
+          </w:tcPr>
+          <w:p>
+            <w:r>
+              <w:rPr>
+                <w:sz w:val="19"/>
+              </w:rPr>
+              <w:t>Explicit "Save" button click</w:t>
+            </w:r>
+          </w:p>
+        </w:tc>
+        <w:tc>
+          <w:tcPr>
+            <w:tcW w:type="dxa" w:w="2835"/>
+          </w:tcPr>
+          <w:p>
+            <w:r>
+              <w:rPr>
+                <w:sz w:val="19"/>
+              </w:rPr>
+              <w:t>Full block state checkpointed with timestamp</w:t>
+            </w:r>
+          </w:p>
+        </w:tc>
+        <w:tc>
+          <w:tcPr>
+            <w:tcW w:type="dxa" w:w="2835"/>
+          </w:tcPr>
+          <w:p>
+            <w:r>
+              <w:rPr>
+                <w:sz w:val="19"/>
+              </w:rPr>
+              <w:t>Toast: "Block saved" + last-saved timestamp updated in block card</w:t>
+            </w:r>
+          </w:p>
+        </w:tc>
+      </w:tr>
+      <w:tr>
+        <w:tc>
+          <w:tcPr>
+            <w:tcW w:type="dxa" w:w="2268"/>
+            <w:shd w:fill="F1F3F6" w:val="clear"/>
+          </w:tcPr>
+          <w:p>
+            <w:r>
+              <w:rPr>
+                <w:sz w:val="19"/>
+              </w:rPr>
+              <w:t>Browser close / navigate away</w:t>
+            </w:r>
+          </w:p>
+        </w:tc>
+        <w:tc>
+          <w:tcPr>
+            <w:tcW w:type="dxa" w:w="2835"/>
+            <w:shd w:fill="F1F3F6" w:val="clear"/>
+          </w:tcPr>
+          <w:p>
+            <w:r>
+              <w:rPr>
+                <w:sz w:val="19"/>
+              </w:rPr>
+              <w:t>beforeunload event triggers final save</w:t>
+            </w:r>
+          </w:p>
+        </w:tc>
+        <w:tc>
+          <w:tcPr>
+            <w:tcW w:type="dxa" w:w="2835"/>
+            <w:shd w:fill="F1F3F6" w:val="clear"/>
+          </w:tcPr>
+          <w:p>
+            <w:r>
+              <w:rPr>
+                <w:sz w:val="19"/>
+              </w:rPr>
+              <w:t>No visual feedback (background save)</w:t>
+            </w:r>
+          </w:p>
+        </w:tc>
+      </w:tr>
+      <w:tr>
+        <w:tc>
+          <w:tcPr>
+            <w:tcW w:type="dxa" w:w="2268"/>
+          </w:tcPr>
+          <w:p>
+            <w:r>
+              <w:rPr>
+                <w:sz w:val="19"/>
+              </w:rPr>
+              <w:t>Page reload / return visit</w:t>
+            </w:r>
+          </w:p>
+        </w:tc>
+        <w:tc>
+          <w:tcPr>
+            <w:tcW w:type="dxa" w:w="2835"/>
+          </w:tcPr>
+          <w:p>
+            <w:r>
+              <w:rPr>
+                <w:sz w:val="19"/>
+              </w:rPr>
+              <w:t>All state restored from localStorage on page load</w:t>
+            </w:r>
+          </w:p>
+        </w:tc>
+        <w:tc>
+          <w:tcPr>
+            <w:tcW w:type="dxa" w:w="2835"/>
+          </w:tcPr>
+          <w:p>
+            <w:r>
+              <w:rPr>
+                <w:sz w:val="19"/>
+              </w:rPr>
+              <w:t>Block cards show saved state with item counts and last-modified timestamps</w:t>
+            </w:r>
+          </w:p>
+        </w:tc>
+      </w:tr>
+    </w:tbl>
+    <w:p>
+      <w:pPr>
+        <w:pStyle w:val="Heading2"/>
+      </w:pPr>
+      <w:r>
+        <w:t>18.2 Save Button Design</w:t>
+      </w:r>
+    </w:p>
+    <w:p>
+      <w:r>
+        <w:t>Each expanded block panel has a sticky footer bar with:</w:t>
+      </w:r>
+    </w:p>
+    <w:p>
+      <w:pPr>
+        <w:pStyle w:val="ListBullet"/>
+        <w:ind w:left="680"/>
+      </w:pPr>
+      <w:r>
+        <w:rPr>
+          <w:b/>
+          <w:sz w:val="20"/>
+        </w:rPr>
+        <w:t>saves current block state, shows timestamp, returns to dashboard</w:t>
+      </w:r>
+      <w:r>
+        <w:rPr>
+          <w:sz w:val="20"/>
+        </w:rPr>
+        <w:t xml:space="preserve">"Save" button (left) — </w:t>
+      </w:r>
+    </w:p>
+    <w:p>
+      <w:pPr>
+        <w:pStyle w:val="ListBullet"/>
+        <w:ind w:left="680"/>
+      </w:pPr>
+      <w:r>
+        <w:rPr>
+          <w:b/>
+          <w:sz w:val="20"/>
+        </w:rPr>
+        <w:t>saves and opens the next incomplete block</w:t>
+      </w:r>
+      <w:r>
+        <w:rPr>
+          <w:sz w:val="20"/>
+        </w:rPr>
+        <w:t xml:space="preserve">"Save &amp; Continue" button (right) — </w:t>
+      </w:r>
+    </w:p>
+    <w:p>
+      <w:pPr>
+        <w:pStyle w:val="ListBullet"/>
+        <w:ind w:left="680"/>
+      </w:pPr>
+      <w:r>
+        <w:rPr>
+          <w:b/>
+          <w:sz w:val="20"/>
+        </w:rPr>
+        <w:t>"Last saved: 2 minutes ago" or "Apr 2, 2026, 3:45 PM" — always visible</w:t>
+      </w:r>
+      <w:r>
+        <w:rPr>
+          <w:sz w:val="20"/>
+        </w:rPr>
+        <w:t xml:space="preserve">Last saved indicator — </w:t>
+      </w:r>
+    </w:p>
+    <w:p>
+      <w:r>
+        <w:t>On the dashboard level, a global "Save All" button is available in the top bar. This checkpoints all blocks simultaneously and shows a confirmation.</w:t>
+      </w:r>
+    </w:p>
+    <w:p>
+      <w:pPr>
+        <w:pStyle w:val="Heading2"/>
+      </w:pPr>
+      <w:r>
+        <w:t>18.3 Block Completion States</w:t>
+      </w:r>
+    </w:p>
+    <w:p>
+      <w:r>
+        <w:t>Each block card on the dashboard shows its current state clearly:</w:t>
+      </w:r>
+    </w:p>
+    <w:tbl>
+      <w:tblPr>
+        <w:tblStyle w:val="TableGrid"/>
+        <w:tblW w:type="auto" w:w="0"/>
+        <w:jc w:val="left"/>
+        <w:tblLook w:firstColumn="1" w:firstRow="1" w:lastColumn="0" w:lastRow="0" w:noHBand="0" w:noVBand="1" w:val="04A0"/>
+      </w:tblPr>
+      <w:tblGrid>
+        <w:gridCol w:w="3135"/>
+        <w:gridCol w:w="3135"/>
+        <w:gridCol w:w="3135"/>
+      </w:tblGrid>
+      <w:tr>
+        <w:tc>
+          <w:tcPr>
+            <w:tcW w:type="dxa" w:w="1417"/>
+            <w:shd w:fill="6366F1" w:val="clear"/>
+          </w:tcPr>
+          <w:p>
+            <w:pPr>
+              <w:jc w:val="left"/>
+            </w:pPr>
+            <w:r>
+              <w:rPr>
+                <w:b/>
+                <w:color w:val="FFFFFF"/>
+                <w:sz w:val="19"/>
+              </w:rPr>
+              <w:t>State</w:t>
+            </w:r>
+          </w:p>
+        </w:tc>
+        <w:tc>
+          <w:tcPr>
+            <w:tcW w:type="dxa" w:w="3118"/>
+            <w:shd w:fill="6366F1" w:val="clear"/>
+          </w:tcPr>
+          <w:p>
+            <w:pPr>
+              <w:jc w:val="left"/>
+            </w:pPr>
+            <w:r>
+              <w:rPr>
+                <w:b/>
+                <w:color w:val="FFFFFF"/>
+                <w:sz w:val="19"/>
+              </w:rPr>
+              <w:t>Block Card Appearance</w:t>
+            </w:r>
+          </w:p>
+        </w:tc>
+        <w:tc>
+          <w:tcPr>
+            <w:tcW w:type="dxa" w:w="3402"/>
+            <w:shd w:fill="6366F1" w:val="clear"/>
+          </w:tcPr>
+          <w:p>
+            <w:pPr>
+              <w:jc w:val="left"/>
+            </w:pPr>
+            <w:r>
+              <w:rPr>
+                <w:b/>
+                <w:color w:val="FFFFFF"/>
+                <w:sz w:val="19"/>
+              </w:rPr>
+              <w:t>Data Behaviour</w:t>
+            </w:r>
+          </w:p>
+        </w:tc>
+      </w:tr>
+      <w:tr>
+        <w:tc>
+          <w:tcPr>
+            <w:tcW w:type="dxa" w:w="1417"/>
+          </w:tcPr>
+          <w:p>
+            <w:r>
+              <w:rPr>
+                <w:sz w:val="19"/>
+              </w:rPr>
+              <w:t>Not Started</w:t>
+            </w:r>
+          </w:p>
+        </w:tc>
+        <w:tc>
+          <w:tcPr>
+            <w:tcW w:type="dxa" w:w="3118"/>
+          </w:tcPr>
+          <w:p>
+            <w:r>
+              <w:rPr>
+                <w:sz w:val="19"/>
+              </w:rPr>
+              <w:t>Gray border, muted icon, "Not started" label. No data indicator.</w:t>
+            </w:r>
+          </w:p>
+        </w:tc>
+        <w:tc>
+          <w:tcPr>
+            <w:tcW w:type="dxa" w:w="3402"/>
+          </w:tcPr>
+          <w:p>
+            <w:r>
+              <w:rPr>
+                <w:sz w:val="19"/>
+              </w:rPr>
+              <w:t>No data in localStorage for this block.</w:t>
+            </w:r>
+          </w:p>
+        </w:tc>
+      </w:tr>
+      <w:tr>
+        <w:tc>
+          <w:tcPr>
+            <w:tcW w:type="dxa" w:w="1417"/>
+            <w:shd w:fill="F1F3F6" w:val="clear"/>
+          </w:tcPr>
+          <w:p>
+            <w:r>
+              <w:rPr>
+                <w:sz w:val="19"/>
+              </w:rPr>
+              <w:t>In Progress (Saved)</w:t>
+            </w:r>
+          </w:p>
+        </w:tc>
+        <w:tc>
+          <w:tcPr>
+            <w:tcW w:type="dxa" w:w="3118"/>
+            <w:shd w:fill="F1F3F6" w:val="clear"/>
+          </w:tcPr>
+          <w:p>
+            <w:r>
+              <w:rPr>
+                <w:sz w:val="19"/>
+              </w:rPr>
+              <w:t>Indigo left border accent. Shows item counts and field summary. "Last saved: [timestamp]" at bottom. Amber dot indicator.</w:t>
+            </w:r>
+          </w:p>
+        </w:tc>
+        <w:tc>
+          <w:tcPr>
+            <w:tcW w:type="dxa" w:w="3402"/>
+            <w:shd w:fill="F1F3F6" w:val="clear"/>
+          </w:tcPr>
+          <w:p>
+            <w:r>
+              <w:rPr>
+                <w:sz w:val="19"/>
+              </w:rPr>
+              <w:t>Partial data exists. Block can be re-opened to continue.</w:t>
+            </w:r>
+          </w:p>
+        </w:tc>
+      </w:tr>
+      <w:tr>
+        <w:tc>
+          <w:tcPr>
+            <w:tcW w:type="dxa" w:w="1417"/>
+          </w:tcPr>
+          <w:p>
+            <w:r>
+              <w:rPr>
+                <w:sz w:val="19"/>
+              </w:rPr>
+              <w:t>Complete</w:t>
+            </w:r>
+          </w:p>
+        </w:tc>
+        <w:tc>
+          <w:tcPr>
+            <w:tcW w:type="dxa" w:w="3118"/>
+          </w:tcPr>
+          <w:p>
+            <w:r>
+              <w:rPr>
+                <w:sz w:val="19"/>
+              </w:rPr>
+              <w:t>Green left border accent. Green checkmark. Full summary counts. "Completed [timestamp]".</w:t>
+            </w:r>
+          </w:p>
+        </w:tc>
+        <w:tc>
+          <w:tcPr>
+            <w:tcW w:type="dxa" w:w="3402"/>
+          </w:tcPr>
+          <w:p>
+            <w:r>
+              <w:rPr>
+                <w:sz w:val="19"/>
+              </w:rPr>
+              <w:t>All required fields filled. Block can still be edited.</w:t>
+            </w:r>
+          </w:p>
+        </w:tc>
+      </w:tr>
+      <w:tr>
+        <w:tc>
+          <w:tcPr>
+            <w:tcW w:type="dxa" w:w="1417"/>
+            <w:shd w:fill="F1F3F6" w:val="clear"/>
+          </w:tcPr>
+          <w:p>
+            <w:r>
+              <w:rPr>
+                <w:sz w:val="19"/>
+              </w:rPr>
+              <w:t>Locked</w:t>
+            </w:r>
+          </w:p>
+        </w:tc>
+        <w:tc>
+          <w:tcPr>
+            <w:tcW w:type="dxa" w:w="3118"/>
+            <w:shd w:fill="F1F3F6" w:val="clear"/>
+          </w:tcPr>
+          <w:p>
+            <w:r>
+              <w:rPr>
+                <w:sz w:val="19"/>
+              </w:rPr>
+              <w:t>Muted background. Lock icon. "Locked [timestamp]". Read-only.</w:t>
+            </w:r>
+          </w:p>
+        </w:tc>
+        <w:tc>
+          <w:tcPr>
+            <w:tcW w:type="dxa" w:w="3402"/>
+            <w:shd w:fill="F1F3F6" w:val="clear"/>
+          </w:tcPr>
+          <w:p>
+            <w:r>
+              <w:rPr>
+                <w:sz w:val="19"/>
+              </w:rPr>
+              <w:t>Data frozen after Level 1 lock. Only viewable, not editable.</w:t>
+            </w:r>
+          </w:p>
+        </w:tc>
+      </w:tr>
+    </w:tbl>
+    <w:p>
+      <w:pPr>
+        <w:pStyle w:val="Heading2"/>
+      </w:pPr>
+      <w:r>
+        <w:t>18.4 localStorage Schema for Save State</w:t>
+      </w:r>
+    </w:p>
+    <w:p>
+      <w:r>
+        <w:rPr>
+          <w:rFonts w:ascii="JetBrains Mono" w:hAnsi="JetBrains Mono"/>
+          <w:sz w:val="18"/>
+        </w:rPr>
+        <w:t>{</w:t>
+        <w:br/>
+        <w:t xml:space="preserve">  "version": "4.0",</w:t>
+        <w:br/>
+        <w:t xml:space="preserve">  "locked": false,</w:t>
+        <w:br/>
+        <w:t xml:space="preserve">  "lockedAt": null,</w:t>
+        <w:br/>
+        <w:t xml:space="preserve">  "lastGlobalSave": "2026-04-02T15:45:00Z",</w:t>
+        <w:br/>
+        <w:t xml:space="preserve">  "blocks": {</w:t>
+        <w:br/>
+        <w:t xml:space="preserve">    "A": {</w:t>
+        <w:br/>
+        <w:t xml:space="preserve">      "status": "complete",       // "not_started" | "in_progress" | "complete" | "locked"</w:t>
+        <w:br/>
+        <w:t xml:space="preserve">      "lastSaved": "2026-04-02T14:30:00Z",</w:t>
+        <w:br/>
+        <w:t xml:space="preserve">      "completedAt": "2026-04-02T14:30:00Z",</w:t>
+        <w:br/>
+        <w:t xml:space="preserve">      "savedBy": "kavitha.r@arcova.sg",</w:t>
+        <w:br/>
+        <w:t xml:space="preserve">      "data": { ... all block A fields ... }</w:t>
+        <w:br/>
+        <w:t xml:space="preserve">    },</w:t>
+        <w:br/>
+        <w:t xml:space="preserve">    "B": {</w:t>
+        <w:br/>
+        <w:t xml:space="preserve">      "status": "in_progress",</w:t>
+        <w:br/>
+        <w:t xml:space="preserve">      "lastSaved": "2026-04-02T15:45:00Z",</w:t>
+        <w:br/>
+        <w:t xml:space="preserve">      "completedAt": null,</w:t>
+        <w:br/>
+        <w:t xml:space="preserve">      "savedBy": "kavitha.r@arcova.sg",</w:t>
+        <w:br/>
+        <w:t xml:space="preserve">      "data": { ... partial block B data ... }</w:t>
+        <w:br/>
+        <w:t xml:space="preserve">    },</w:t>
+        <w:br/>
+        <w:t xml:space="preserve">    "C": {</w:t>
+        <w:br/>
+        <w:t xml:space="preserve">      "status": "not_started",</w:t>
+        <w:br/>
+        <w:t xml:space="preserve">      "lastSaved": null,</w:t>
+        <w:br/>
+        <w:t xml:space="preserve">      "completedAt": null,</w:t>
+        <w:br/>
+        <w:t xml:space="preserve">      "savedBy": null,</w:t>
+        <w:br/>
+        <w:t xml:space="preserve">      "data": {}</w:t>
+        <w:br/>
+        <w:t xml:space="preserve">    },</w:t>
+        <w:br/>
+        <w:t xml:space="preserve">    ... (D through M)</w:t>
+        <w:br/>
+        <w:t xml:space="preserve">  }</w:t>
+        <w:br/>
+        <w:t>}</w:t>
+      </w:r>
+    </w:p>
+    <w:p>
+      <w:r>
+        <w:br w:type="page"/>
+      </w:r>
+    </w:p>
+    <w:p>
+      <w:pPr>
+        <w:pStyle w:val="Heading1"/>
+      </w:pPr>
+      <w:r>
+        <w:t>19. Saved Block View — Read-Only with Edit Option</w:t>
+      </w:r>
+    </w:p>
+    <w:p>
+      <w:r>
+        <w:t>When a user opens a block that has previously saved data, the block does NOT show empty forms. Instead, it renders the saved data in a clean, read-only summary view. The user can see everything that was captured at a glance, and selectively edit individual sections or fields using inline edit controls. This is critical for the multi-session workflow — stakeholders returning after days or weeks need to quickly review what was captured and make targeted updates, not re-navigate through empty form screens.</w:t>
+      </w:r>
+    </w:p>
+    <w:p>
+      <w:pPr>
+        <w:pStyle w:val="Heading2"/>
+      </w:pPr>
+      <w:r>
+        <w:t>19.1 Read-Only Summary View</w:t>
+      </w:r>
+    </w:p>
+    <w:p>
+      <w:r>
+        <w:t>When a block with saved data is opened, it renders in "Review Mode" by default:</w:t>
+      </w:r>
+    </w:p>
+    <w:p>
+      <w:pPr>
+        <w:pStyle w:val="ListBullet"/>
+        <w:ind w:left="680"/>
+      </w:pPr>
+      <w:r>
+        <w:rPr>
+          <w:sz w:val="20"/>
+        </w:rPr>
+        <w:t>All saved data displayed as formatted text, chips, tags, and summary cards — not in editable form fields</w:t>
+      </w:r>
+    </w:p>
+    <w:p>
+      <w:pPr>
+        <w:pStyle w:val="ListBullet"/>
+        <w:ind w:left="680"/>
+      </w:pPr>
+      <w:r>
+        <w:rPr>
+          <w:sz w:val="20"/>
+        </w:rPr>
+        <w:t>List items (skills, roles, standards, etc.) shown as a compact table or chip list with key attributes visible</w:t>
+      </w:r>
+    </w:p>
+    <w:p>
+      <w:pPr>
+        <w:pStyle w:val="ListBullet"/>
+        <w:ind w:left="680"/>
+      </w:pPr>
+      <w:r>
+        <w:rPr>
+          <w:sz w:val="20"/>
+        </w:rPr>
+        <w:t>Hierarchy shown as a visual tree (not the builder)</w:t>
+      </w:r>
+    </w:p>
+    <w:p>
+      <w:pPr>
+        <w:pStyle w:val="ListBullet"/>
+        <w:ind w:left="680"/>
+      </w:pPr>
+      <w:r>
+        <w:rPr>
+          <w:sz w:val="20"/>
+        </w:rPr>
+        <w:t>Empty/unfilled optional fields are hidden (not shown as blank inputs)</w:t>
+      </w:r>
+    </w:p>
+    <w:p>
+      <w:pPr>
+        <w:pStyle w:val="ListBullet"/>
+        <w:ind w:left="680"/>
+      </w:pPr>
+      <w:r>
+        <w:rPr>
+          <w:sz w:val="20"/>
+        </w:rPr>
+        <w:t>Each section has a small pencil icon ("Edit") in the top-right corner</w:t>
+      </w:r>
+    </w:p>
+    <w:p>
+      <w:pPr>
+        <w:pStyle w:val="ListBullet"/>
+        <w:ind w:left="680"/>
+      </w:pPr>
+      <w:r>
+        <w:rPr>
+          <w:sz w:val="20"/>
+        </w:rPr>
+        <w:t>Overall block header shows: block title, completion status, last saved timestamp, "Edit All" button</w:t>
+      </w:r>
+    </w:p>
+    <w:p>
+      <w:pPr>
+        <w:pStyle w:val="Heading2"/>
+      </w:pPr>
+      <w:r>
+        <w:t>19.2 Inline Edit Model</w:t>
+      </w:r>
+    </w:p>
+    <w:p>
+      <w:r>
+        <w:t>Users can enter edit mode at three levels of granularity:</w:t>
+      </w:r>
+    </w:p>
+    <w:tbl>
+      <w:tblPr>
+        <w:tblStyle w:val="TableGrid"/>
+        <w:tblW w:type="auto" w:w="0"/>
+        <w:jc w:val="left"/>
+        <w:tblLook w:firstColumn="1" w:firstRow="1" w:lastColumn="0" w:lastRow="0" w:noHBand="0" w:noVBand="1" w:val="04A0"/>
+      </w:tblPr>
+      <w:tblGrid>
+        <w:gridCol w:w="3135"/>
+        <w:gridCol w:w="3135"/>
+        <w:gridCol w:w="3135"/>
+      </w:tblGrid>
+      <w:tr>
+        <w:tc>
+          <w:tcPr>
+            <w:tcW w:type="dxa" w:w="1417"/>
+            <w:shd w:fill="6366F1" w:val="clear"/>
+          </w:tcPr>
+          <w:p>
+            <w:pPr>
+              <w:jc w:val="left"/>
+            </w:pPr>
+            <w:r>
+              <w:rPr>
+                <w:b/>
+                <w:color w:val="FFFFFF"/>
+                <w:sz w:val="19"/>
+              </w:rPr>
+              <w:t>Edit Level</w:t>
+            </w:r>
+          </w:p>
+        </w:tc>
+        <w:tc>
+          <w:tcPr>
+            <w:tcW w:type="dxa" w:w="3402"/>
+            <w:shd w:fill="6366F1" w:val="clear"/>
+          </w:tcPr>
+          <w:p>
+            <w:pPr>
+              <w:jc w:val="left"/>
+            </w:pPr>
+            <w:r>
+              <w:rPr>
+                <w:b/>
+                <w:color w:val="FFFFFF"/>
+                <w:sz w:val="19"/>
+              </w:rPr>
+              <w:t>How It Works</w:t>
+            </w:r>
+          </w:p>
+        </w:tc>
+        <w:tc>
+          <w:tcPr>
+            <w:tcW w:type="dxa" w:w="3118"/>
+            <w:shd w:fill="6366F1" w:val="clear"/>
+          </w:tcPr>
+          <w:p>
+            <w:pPr>
+              <w:jc w:val="left"/>
+            </w:pPr>
+            <w:r>
+              <w:rPr>
+                <w:b/>
+                <w:color w:val="FFFFFF"/>
+                <w:sz w:val="19"/>
+              </w:rPr>
+              <w:t>Visual Treatment</w:t>
+            </w:r>
+          </w:p>
+        </w:tc>
+      </w:tr>
+      <w:tr>
+        <w:tc>
+          <w:tcPr>
+            <w:tcW w:type="dxa" w:w="1417"/>
+          </w:tcPr>
+          <w:p>
+            <w:r>
+              <w:rPr>
+                <w:sz w:val="19"/>
+              </w:rPr>
+              <w:t>Single field edit</w:t>
+            </w:r>
+          </w:p>
+        </w:tc>
+        <w:tc>
+          <w:tcPr>
+            <w:tcW w:type="dxa" w:w="3402"/>
+          </w:tcPr>
+          <w:p>
+            <w:r>
+              <w:rPr>
+                <w:sz w:val="19"/>
+              </w:rPr>
+              <w:t>Click the field value text → it transforms into an editable input inline. Press Enter or click away to save. The field reverts to read-only display.</w:t>
+            </w:r>
+          </w:p>
+        </w:tc>
+        <w:tc>
+          <w:tcPr>
+            <w:tcW w:type="dxa" w:w="3118"/>
+          </w:tcPr>
+          <w:p>
+            <w:r>
+              <w:rPr>
+                <w:sz w:val="19"/>
+              </w:rPr>
+              <w:t>Field text gets a subtle blue underline on hover indicating it's clickable. On click, transitions to an input with a blue border. Save/cancel icons appear.</w:t>
+            </w:r>
+          </w:p>
+        </w:tc>
+      </w:tr>
+      <w:tr>
+        <w:tc>
+          <w:tcPr>
+            <w:tcW w:type="dxa" w:w="1417"/>
+            <w:shd w:fill="F1F3F6" w:val="clear"/>
+          </w:tcPr>
+          <w:p>
+            <w:r>
+              <w:rPr>
+                <w:sz w:val="19"/>
+              </w:rPr>
+              <w:t>Section edit</w:t>
+            </w:r>
+          </w:p>
+        </w:tc>
+        <w:tc>
+          <w:tcPr>
+            <w:tcW w:type="dxa" w:w="3402"/>
+            <w:shd w:fill="F1F3F6" w:val="clear"/>
+          </w:tcPr>
+          <w:p>
+            <w:r>
+              <w:rPr>
+                <w:sz w:val="19"/>
+              </w:rPr>
+              <w:t>Click the pencil icon on a section header (e.g., "Strategic Priorities" section within Block C). The entire section switches to form mode while other sections remain read-only.</w:t>
+            </w:r>
+          </w:p>
+        </w:tc>
+        <w:tc>
+          <w:tcPr>
+            <w:tcW w:type="dxa" w:w="3118"/>
+            <w:shd w:fill="F1F3F6" w:val="clear"/>
+          </w:tcPr>
+          <w:p>
+            <w:r>
+              <w:rPr>
+                <w:sz w:val="19"/>
+              </w:rPr>
+              <w:t>Section gets a light indigo background. Form fields appear. "Done" button at bottom of section to return to read-only.</w:t>
+            </w:r>
+          </w:p>
+        </w:tc>
+      </w:tr>
+      <w:tr>
+        <w:tc>
+          <w:tcPr>
+            <w:tcW w:type="dxa" w:w="1417"/>
+          </w:tcPr>
+          <w:p>
+            <w:r>
+              <w:rPr>
+                <w:sz w:val="19"/>
+              </w:rPr>
+              <w:t>Full block edit</w:t>
+            </w:r>
+          </w:p>
+        </w:tc>
+        <w:tc>
+          <w:tcPr>
+            <w:tcW w:type="dxa" w:w="3402"/>
+          </w:tcPr>
+          <w:p>
+            <w:r>
+              <w:rPr>
+                <w:sz w:val="19"/>
+              </w:rPr>
+              <w:t>Click "Edit All" button in block header. Entire block switches to full form mode (same as first-time entry experience).</w:t>
+            </w:r>
+          </w:p>
+        </w:tc>
+        <w:tc>
+          <w:tcPr>
+            <w:tcW w:type="dxa" w:w="3118"/>
+          </w:tcPr>
+          <w:p>
+            <w:r>
+              <w:rPr>
+                <w:sz w:val="19"/>
+              </w:rPr>
+              <w:t>All sections become editable. Useful when major updates are needed. "Save &amp; Close" returns to dashboard.</w:t>
+            </w:r>
+          </w:p>
+        </w:tc>
+      </w:tr>
+    </w:tbl>
+    <w:p>
+      <w:pPr>
+        <w:pStyle w:val="Heading2"/>
+      </w:pPr>
+      <w:r>
+        <w:t>19.3 Example: Block A (Organisation Identity) — Saved View</w:t>
+      </w:r>
+    </w:p>
+    <w:p>
+      <w:r>
+        <w:t>When Block A has been saved and the user re-opens it:</w:t>
+      </w:r>
+    </w:p>
+    <w:p>
+      <w:r>
+        <w:rPr>
+          <w:rFonts w:ascii="JetBrains Mono" w:hAnsi="JetBrains Mono"/>
+          <w:color w:val="4B5563"/>
+          <w:sz w:val="16"/>
+        </w:rPr>
+        <w:t>┌──────────────────────────────────────────────────────────────┐</w:t>
+        <w:br/>
+        <w:t>│  ← Back to Dashboard                                        │</w:t>
+        <w:br/>
+        <w:t>│                                                              │</w:t>
+        <w:br/>
+        <w:t>│  Organisation Identity                    [Edit All]         │</w:t>
+        <w:br/>
+        <w:t>│  Last saved: Apr 2, 2026, 3:45 PM · Kavitha R.              │</w:t>
+        <w:br/>
+        <w:t>│                                                              │</w:t>
+        <w:br/>
+        <w:t>│  ┌──────────────────────────────────────────────────────┐    │</w:t>
+        <w:br/>
+        <w:t>│  │  Legal Name        Arcova Infrastructure Pte. Ltd.   │    │</w:t>
+        <w:br/>
+        <w:t>│  │  Trading Name      Arcova                            │    │</w:t>
+        <w:br/>
+        <w:t>│  │  Industry           Infrastructure &amp; Construction     │    │</w:t>
+        <w:br/>
+        <w:t>│  │  Secondary          Smart Buildings, BIM Consulting   │    │</w:t>
+        <w:br/>
+        <w:t>│  │  Headcount          812 (proj. 900 @12m, 1050 @24m) │    │</w:t>
+        <w:br/>
+        <w:t>│  │  Operating Model    Services + Consulting hybrid      │    │</w:t>
+        <w:br/>
+        <w:t>│  │  Maturity           Growth                            │    │</w:t>
+        <w:br/>
+        <w:t>│  │  HQ                 Singapore                   [✎]  │    │</w:t>
+        <w:br/>
+        <w:t>│  │  Fiscal Year        January                          │    │</w:t>
+        <w:br/>
+        <w:t>│  │  Core Values        Safety · Excellence · Innovation │    │</w:t>
+        <w:br/>
+        <w:t>│  │                     Integrity · Respect              │    │</w:t>
+        <w:br/>
+        <w:t>│  └──────────────────────────────────────────────────────┘    │</w:t>
+        <w:br/>
+        <w:t>│                                                              │</w:t>
+        <w:br/>
+        <w:t>│  Subsidiaries                                         [✎]   │</w:t>
+        <w:br/>
+        <w:t>│  ┌────────────────────────────────────────────────────┐     │</w:t>
+        <w:br/>
+        <w:t>│  │  Arcova India Pvt. Ltd.  ·  India  ·  Subsidiary  │     │</w:t>
+        <w:br/>
+        <w:t>│  │  Arcova Digital Pte.     ·  SG     ·  Subsidiary  │     │</w:t>
+        <w:br/>
+        <w:t>│  └────────────────────────────────────────────────────┘     │</w:t>
+        <w:br/>
+        <w:t>│                                                              │</w:t>
+        <w:br/>
+        <w:t>│  Culture Definition                                   [✎]   │</w:t>
+        <w:br/>
+        <w:t>│  "Safety-first, engineering excellence driven, with a        │</w:t>
+        <w:br/>
+        <w:t>│   growing emphasis on digital innovation and sustainability" │</w:t>
+        <w:br/>
+        <w:t>│                                                              │</w:t>
+        <w:br/>
+        <w:t>│                                          [Save] [Save &amp; →]  │</w:t>
+        <w:br/>
+        <w:t>└──────────────────────────────────────────────────────────────┘</w:t>
+      </w:r>
+    </w:p>
+    <w:p>
+      <w:pPr>
+        <w:pStyle w:val="Heading2"/>
+      </w:pPr>
+      <w:r>
+        <w:t>19.4 Example: Block J (Skills Dictionary) — Saved View</w:t>
+      </w:r>
+    </w:p>
+    <w:p>
+      <w:r>
+        <w:t>List-heavy blocks like Skills Dictionary show a compact summary table:</w:t>
+      </w:r>
+    </w:p>
+    <w:p>
+      <w:r>
+        <w:rPr>
+          <w:rFonts w:ascii="JetBrains Mono" w:hAnsi="JetBrains Mono"/>
+          <w:color w:val="4B5563"/>
+          <w:sz w:val="16"/>
+        </w:rPr>
+        <w:t>┌──────────────────────────────────────────────────────────────┐</w:t>
+        <w:br/>
+        <w:t>│  ← Back                                                      │</w:t>
+        <w:br/>
+        <w:t>│                                                              │</w:t>
+        <w:br/>
+        <w:t>│  Skills Dictionary                        [Edit All]         │</w:t>
+        <w:br/>
+        <w:t>│  4 domains · 32 skills · Last saved: Apr 2                   │</w:t>
+        <w:br/>
+        <w:t>│                                                              │</w:t>
+        <w:br/>
+        <w:t>│  ▸ Engineering &amp; Construction (12 skills)             [✎]   │</w:t>
+        <w:br/>
+        <w:t>│    ┌──────────────────────────────────────────────────┐     │</w:t>
+        <w:br/>
+        <w:t>│    │ Finite Element Analysis  Tech   C1   L1-L4 ✓    │     │</w:t>
+        <w:br/>
+        <w:t>│    │ Structural Design Codes  Tech   C1   L1-L4 ✓    │     │</w:t>
+        <w:br/>
+        <w:t>│    │ BIM Modeling (Revit)     Tool   C2   L1-L4 ✓    │     │</w:t>
+        <w:br/>
+        <w:t>│    │ Seismic Design           Tech   C2   L1-L4 ✓    │     │</w:t>
+        <w:br/>
+        <w:t>│    │ ... +8 more                                      │     │</w:t>
+        <w:br/>
+        <w:t>│    └──────────────────────────────────────────────────┘     │</w:t>
+        <w:br/>
+        <w:t>│                                                              │</w:t>
+        <w:br/>
+        <w:t>│  ▸ Digital &amp; Technology (8 skills)                     [✎]   │</w:t>
+        <w:br/>
+        <w:t>│  ▸ Project Management (6 skills)                      [✎]   │</w:t>
+        <w:br/>
+        <w:t>│  ▸ Safety &amp; Compliance (6 skills)                     [✎]   │</w:t>
+        <w:br/>
+        <w:t>│                                                              │</w:t>
+        <w:br/>
+        <w:t>│  Click any skill row to view full details.                   │</w:t>
+        <w:br/>
+        <w:t>│  Click [✎] to edit a domain section.                        │</w:t>
+        <w:br/>
+        <w:t>│                                                              │</w:t>
+        <w:br/>
+        <w:t>│                                          [Save] [Save &amp; →]  │</w:t>
+        <w:br/>
+        <w:t>└──────────────────────────────────────────────────────────────┘</w:t>
+      </w:r>
+    </w:p>
+    <w:p>
+      <w:pPr>
+        <w:pStyle w:val="Heading2"/>
+      </w:pPr>
+      <w:r>
+        <w:t>19.5 Example: Block B (Hierarchy) — Saved View</w:t>
+      </w:r>
+    </w:p>
+    <w:p>
+      <w:r>
+        <w:t>The hierarchy block shows the visual tree in read-only mode with an "Edit Structure" button:</w:t>
+      </w:r>
+    </w:p>
+    <w:p>
+      <w:pPr>
+        <w:pStyle w:val="ListBullet"/>
+        <w:ind w:left="680"/>
+      </w:pPr>
+      <w:r>
+        <w:rPr>
+          <w:sz w:val="20"/>
+        </w:rPr>
+        <w:t>Tree displayed as an interactive (but non-editable) org chart — nodes clickable for details</w:t>
+      </w:r>
+    </w:p>
+    <w:p>
+      <w:pPr>
+        <w:pStyle w:val="ListBullet"/>
+        <w:ind w:left="680"/>
+      </w:pPr>
+      <w:r>
+        <w:rPr>
+          <w:sz w:val="20"/>
+        </w:rPr>
+        <w:t>Level summary: "4 levels: Organisation → Division → Department → Team"</w:t>
+      </w:r>
+    </w:p>
+    <w:p>
+      <w:pPr>
+        <w:pStyle w:val="ListBullet"/>
+        <w:ind w:left="680"/>
+      </w:pPr>
+      <w:r>
+        <w:rPr>
+          <w:sz w:val="20"/>
+        </w:rPr>
+        <w:t>Node count: "12 nodes configured (10 active, 2 inactive)"</w:t>
+      </w:r>
+    </w:p>
+    <w:p>
+      <w:pPr>
+        <w:pStyle w:val="ListBullet"/>
+        <w:ind w:left="680"/>
+      </w:pPr>
+      <w:r>
+        <w:rPr>
+          <w:sz w:val="20"/>
+        </w:rPr>
+        <w:t>Secondary hierarchies listed: "1 secondary hierarchy: Project Structure (3 levels, 5 nodes)"</w:t>
+      </w:r>
+    </w:p>
+    <w:p>
+      <w:pPr>
+        <w:pStyle w:val="ListBullet"/>
+        <w:ind w:left="680"/>
+      </w:pPr>
+      <w:r>
+        <w:rPr>
+          <w:sz w:val="20"/>
+        </w:rPr>
+        <w:t>"Edit Structure" button switches to the full tree builder</w:t>
+      </w:r>
+    </w:p>
+    <w:p>
+      <w:pPr>
+        <w:pStyle w:val="Heading2"/>
+      </w:pPr>
+      <w:r>
+        <w:t>19.6 Handling Incomplete Blocks (In Progress)</w:t>
+      </w:r>
+    </w:p>
+    <w:p>
+      <w:r>
+        <w:t>When a block is in "in_progress" state (partially filled), the saved view shows:</w:t>
+      </w:r>
+    </w:p>
+    <w:p>
+      <w:pPr>
+        <w:pStyle w:val="ListBullet"/>
+        <w:ind w:left="680"/>
+      </w:pPr>
+      <w:r>
+        <w:rPr>
+          <w:sz w:val="20"/>
+        </w:rPr>
+        <w:t>Filled fields in read-only summary format</w:t>
+      </w:r>
+    </w:p>
+    <w:p>
+      <w:pPr>
+        <w:pStyle w:val="ListBullet"/>
+        <w:ind w:left="680"/>
+      </w:pPr>
+      <w:r>
+        <w:rPr>
+          <w:sz w:val="20"/>
+        </w:rPr>
+        <w:t>Unfilled required fields highlighted with an amber "Not yet filled" indicator</w:t>
+      </w:r>
+    </w:p>
+    <w:p>
+      <w:pPr>
+        <w:pStyle w:val="ListBullet"/>
+        <w:ind w:left="680"/>
+      </w:pPr>
+      <w:r>
+        <w:rPr>
+          <w:sz w:val="20"/>
+        </w:rPr>
+        <w:t>A "Continue Setup" button (prominent) alongside the "Edit" button</w:t>
+      </w:r>
+    </w:p>
+    <w:p>
+      <w:pPr>
+        <w:pStyle w:val="ListBullet"/>
+        <w:ind w:left="680"/>
+      </w:pPr>
+      <w:r>
+        <w:rPr>
+          <w:sz w:val="20"/>
+        </w:rPr>
+        <w:t>A completion indicator: "6 of 18 fields completed" with a mini progress bar</w:t>
+      </w:r>
+    </w:p>
+    <w:p>
+      <w:r>
+        <w:t>Clicking "Continue Setup" takes the user to the first unfilled required field, skipping past already-completed fields. This is critical for resuming efficiently after a break.</w:t>
+      </w:r>
+    </w:p>
+    <w:p>
+      <w:pPr>
+        <w:pStyle w:val="Heading2"/>
+      </w:pPr>
+      <w:r>
+        <w:t>19.7 Multi-Stakeholder Workflow</w:t>
+      </w:r>
+    </w:p>
+    <w:p>
+      <w:r>
+        <w:t>In practice, different parts of OrgSetup are filled by different people:</w:t>
+      </w:r>
+    </w:p>
+    <w:tbl>
+      <w:tblPr>
+        <w:tblStyle w:val="TableGrid"/>
+        <w:tblW w:type="auto" w:w="0"/>
+        <w:jc w:val="left"/>
+        <w:tblLook w:firstColumn="1" w:firstRow="1" w:lastColumn="0" w:lastRow="0" w:noHBand="0" w:noVBand="1" w:val="04A0"/>
+      </w:tblPr>
+      <w:tblGrid>
+        <w:gridCol w:w="3135"/>
+        <w:gridCol w:w="3135"/>
+        <w:gridCol w:w="3135"/>
+      </w:tblGrid>
+      <w:tr>
+        <w:tc>
+          <w:tcPr>
+            <w:tcW w:type="dxa" w:w="1701"/>
+            <w:shd w:fill="6366F1" w:val="clear"/>
+          </w:tcPr>
+          <w:p>
+            <w:pPr>
+              <w:jc w:val="left"/>
+            </w:pPr>
+            <w:r>
+              <w:rPr>
+                <w:b/>
+                <w:color w:val="FFFFFF"/>
+                <w:sz w:val="19"/>
+              </w:rPr>
+              <w:t>Block</w:t>
+            </w:r>
+          </w:p>
+        </w:tc>
+        <w:tc>
+          <w:tcPr>
+            <w:tcW w:type="dxa" w:w="1701"/>
+            <w:shd w:fill="6366F1" w:val="clear"/>
+          </w:tcPr>
+          <w:p>
+            <w:pPr>
+              <w:jc w:val="left"/>
+            </w:pPr>
+            <w:r>
+              <w:rPr>
+                <w:b/>
+                <w:color w:val="FFFFFF"/>
+                <w:sz w:val="19"/>
+              </w:rPr>
+              <w:t>Primary Owner</w:t>
+            </w:r>
+          </w:p>
+        </w:tc>
+        <w:tc>
+          <w:tcPr>
+            <w:tcW w:type="dxa" w:w="4535"/>
+            <w:shd w:fill="6366F1" w:val="clear"/>
+          </w:tcPr>
+          <w:p>
+            <w:pPr>
+              <w:jc w:val="left"/>
+            </w:pPr>
+            <w:r>
+              <w:rPr>
+                <w:b/>
+                <w:color w:val="FFFFFF"/>
+                <w:sz w:val="19"/>
+              </w:rPr>
+              <w:t>Typical Workflow</w:t>
+            </w:r>
+          </w:p>
+        </w:tc>
+      </w:tr>
+      <w:tr>
+        <w:tc>
+          <w:tcPr>
+            <w:tcW w:type="dxa" w:w="1701"/>
+          </w:tcPr>
+          <w:p>
+            <w:r>
+              <w:rPr>
+                <w:sz w:val="19"/>
+              </w:rPr>
+              <w:t>A: Org Identity</w:t>
+            </w:r>
+          </w:p>
+        </w:tc>
+        <w:tc>
+          <w:tcPr>
+            <w:tcW w:type="dxa" w:w="1701"/>
+          </w:tcPr>
+          <w:p>
+            <w:r>
+              <w:rPr>
+                <w:sz w:val="19"/>
+              </w:rPr>
+              <w:t>HR Admin</w:t>
+            </w:r>
+          </w:p>
+        </w:tc>
+        <w:tc>
+          <w:tcPr>
+            <w:tcW w:type="dxa" w:w="4535"/>
+          </w:tcPr>
+          <w:p>
+            <w:r>
+              <w:rPr>
+                <w:sz w:val="19"/>
+              </w:rPr>
+              <w:t>Filled first. Quick session.</w:t>
+            </w:r>
+          </w:p>
+        </w:tc>
+      </w:tr>
+      <w:tr>
+        <w:tc>
+          <w:tcPr>
+            <w:tcW w:type="dxa" w:w="1701"/>
+            <w:shd w:fill="F1F3F6" w:val="clear"/>
+          </w:tcPr>
+          <w:p>
+            <w:r>
+              <w:rPr>
+                <w:sz w:val="19"/>
+              </w:rPr>
+              <w:t>B: Hierarchy</w:t>
+            </w:r>
+          </w:p>
+        </w:tc>
+        <w:tc>
+          <w:tcPr>
+            <w:tcW w:type="dxa" w:w="1701"/>
+            <w:shd w:fill="F1F3F6" w:val="clear"/>
+          </w:tcPr>
+          <w:p>
+            <w:r>
+              <w:rPr>
+                <w:sz w:val="19"/>
+              </w:rPr>
+              <w:t>HR Admin + Org Design lead</w:t>
+            </w:r>
+          </w:p>
+        </w:tc>
+        <w:tc>
+          <w:tcPr>
+            <w:tcW w:type="dxa" w:w="4535"/>
+            <w:shd w:fill="F1F3F6" w:val="clear"/>
+          </w:tcPr>
+          <w:p>
+            <w:r>
+              <w:rPr>
+                <w:sz w:val="19"/>
+              </w:rPr>
+              <w:t>May take multiple sessions. Needs input from leadership.</w:t>
+            </w:r>
+          </w:p>
+        </w:tc>
+      </w:tr>
+      <w:tr>
+        <w:tc>
+          <w:tcPr>
+            <w:tcW w:type="dxa" w:w="1701"/>
+          </w:tcPr>
+          <w:p>
+            <w:r>
+              <w:rPr>
+                <w:sz w:val="19"/>
+              </w:rPr>
+              <w:t>C: Strategy</w:t>
+            </w:r>
+          </w:p>
+        </w:tc>
+        <w:tc>
+          <w:tcPr>
+            <w:tcW w:type="dxa" w:w="1701"/>
+          </w:tcPr>
+          <w:p>
+            <w:r>
+              <w:rPr>
+                <w:sz w:val="19"/>
+              </w:rPr>
+              <w:t>CHRO / Strategy team</w:t>
+            </w:r>
+          </w:p>
+        </w:tc>
+        <w:tc>
+          <w:tcPr>
+            <w:tcW w:type="dxa" w:w="4535"/>
+          </w:tcPr>
+          <w:p>
+            <w:r>
+              <w:rPr>
+                <w:sz w:val="19"/>
+              </w:rPr>
+              <w:t>Often needs strategy deck uploaded. May be delegated.</w:t>
+            </w:r>
+          </w:p>
+        </w:tc>
+      </w:tr>
+      <w:tr>
+        <w:tc>
+          <w:tcPr>
+            <w:tcW w:type="dxa" w:w="1701"/>
+            <w:shd w:fill="F1F3F6" w:val="clear"/>
+          </w:tcPr>
+          <w:p>
+            <w:r>
+              <w:rPr>
+                <w:sz w:val="19"/>
+              </w:rPr>
+              <w:t>D: Products</w:t>
+            </w:r>
+          </w:p>
+        </w:tc>
+        <w:tc>
+          <w:tcPr>
+            <w:tcW w:type="dxa" w:w="1701"/>
+            <w:shd w:fill="F1F3F6" w:val="clear"/>
+          </w:tcPr>
+          <w:p>
+            <w:r>
+              <w:rPr>
+                <w:sz w:val="19"/>
+              </w:rPr>
+              <w:t>Business unit heads</w:t>
+            </w:r>
+          </w:p>
+        </w:tc>
+        <w:tc>
+          <w:tcPr>
+            <w:tcW w:type="dxa" w:w="4535"/>
+            <w:shd w:fill="F1F3F6" w:val="clear"/>
+          </w:tcPr>
+          <w:p>
+            <w:r>
+              <w:rPr>
+                <w:sz w:val="19"/>
+              </w:rPr>
+              <w:t>Each BU head fills their section.</w:t>
+            </w:r>
+          </w:p>
+        </w:tc>
+      </w:tr>
+      <w:tr>
+        <w:tc>
+          <w:tcPr>
+            <w:tcW w:type="dxa" w:w="1701"/>
+          </w:tcPr>
+          <w:p>
+            <w:r>
+              <w:rPr>
+                <w:sz w:val="19"/>
+              </w:rPr>
+              <w:t>E: Clients</w:t>
+            </w:r>
+          </w:p>
+        </w:tc>
+        <w:tc>
+          <w:tcPr>
+            <w:tcW w:type="dxa" w:w="1701"/>
+          </w:tcPr>
+          <w:p>
+            <w:r>
+              <w:rPr>
+                <w:sz w:val="19"/>
+              </w:rPr>
+              <w:t>Sales / Account team</w:t>
+            </w:r>
+          </w:p>
+        </w:tc>
+        <w:tc>
+          <w:tcPr>
+            <w:tcW w:type="dxa" w:w="4535"/>
+          </w:tcPr>
+          <w:p>
+            <w:r>
+              <w:rPr>
+                <w:sz w:val="19"/>
+              </w:rPr>
+              <w:t>Client data may come from CRM export.</w:t>
+            </w:r>
+          </w:p>
+        </w:tc>
+      </w:tr>
+      <w:tr>
+        <w:tc>
+          <w:tcPr>
+            <w:tcW w:type="dxa" w:w="1701"/>
+            <w:shd w:fill="F1F3F6" w:val="clear"/>
+          </w:tcPr>
+          <w:p>
+            <w:r>
+              <w:rPr>
+                <w:sz w:val="19"/>
+              </w:rPr>
+              <w:t>F: Standards</w:t>
+            </w:r>
+          </w:p>
+        </w:tc>
+        <w:tc>
+          <w:tcPr>
+            <w:tcW w:type="dxa" w:w="1701"/>
+            <w:shd w:fill="F1F3F6" w:val="clear"/>
+          </w:tcPr>
+          <w:p>
+            <w:r>
+              <w:rPr>
+                <w:sz w:val="19"/>
+              </w:rPr>
+              <w:t>Compliance / Quality team</w:t>
+            </w:r>
+          </w:p>
+        </w:tc>
+        <w:tc>
+          <w:tcPr>
+            <w:tcW w:type="dxa" w:w="4535"/>
+            <w:shd w:fill="F1F3F6" w:val="clear"/>
+          </w:tcPr>
+          <w:p>
+            <w:r>
+              <w:rPr>
+                <w:sz w:val="19"/>
+              </w:rPr>
+              <w:t>Requires audit records and cert dates.</w:t>
+            </w:r>
+          </w:p>
+        </w:tc>
+      </w:tr>
+      <w:tr>
+        <w:tc>
+          <w:tcPr>
+            <w:tcW w:type="dxa" w:w="1701"/>
+          </w:tcPr>
+          <w:p>
+            <w:r>
+              <w:rPr>
+                <w:sz w:val="19"/>
+              </w:rPr>
+              <w:t>G: Tools</w:t>
+            </w:r>
+          </w:p>
+        </w:tc>
+        <w:tc>
+          <w:tcPr>
+            <w:tcW w:type="dxa" w:w="1701"/>
+          </w:tcPr>
+          <w:p>
+            <w:r>
+              <w:rPr>
+                <w:sz w:val="19"/>
+              </w:rPr>
+              <w:t>IT / Engineering leads</w:t>
+            </w:r>
+          </w:p>
+        </w:tc>
+        <w:tc>
+          <w:tcPr>
+            <w:tcW w:type="dxa" w:w="4535"/>
+          </w:tcPr>
+          <w:p>
+            <w:r>
+              <w:rPr>
+                <w:sz w:val="19"/>
+              </w:rPr>
+              <w:t>Per-team tool inventory.</w:t>
+            </w:r>
+          </w:p>
+        </w:tc>
+      </w:tr>
+      <w:tr>
+        <w:tc>
+          <w:tcPr>
+            <w:tcW w:type="dxa" w:w="1701"/>
+            <w:shd w:fill="F1F3F6" w:val="clear"/>
+          </w:tcPr>
+          <w:p>
+            <w:r>
+              <w:rPr>
+                <w:sz w:val="19"/>
+              </w:rPr>
+              <w:t>H-I: Criticality + Proficiency</w:t>
+            </w:r>
+          </w:p>
+        </w:tc>
+        <w:tc>
+          <w:tcPr>
+            <w:tcW w:type="dxa" w:w="1701"/>
+            <w:shd w:fill="F1F3F6" w:val="clear"/>
+          </w:tcPr>
+          <w:p>
+            <w:r>
+              <w:rPr>
+                <w:sz w:val="19"/>
+              </w:rPr>
+              <w:t>HR + Department heads</w:t>
+            </w:r>
+          </w:p>
+        </w:tc>
+        <w:tc>
+          <w:tcPr>
+            <w:tcW w:type="dxa" w:w="4535"/>
+            <w:shd w:fill="F1F3F6" w:val="clear"/>
+          </w:tcPr>
+          <w:p>
+            <w:r>
+              <w:rPr>
+                <w:sz w:val="19"/>
+              </w:rPr>
+              <w:t>Calibration session needed.</w:t>
+            </w:r>
+          </w:p>
+        </w:tc>
+      </w:tr>
+      <w:tr>
+        <w:tc>
+          <w:tcPr>
+            <w:tcW w:type="dxa" w:w="1701"/>
+          </w:tcPr>
+          <w:p>
+            <w:r>
+              <w:rPr>
+                <w:sz w:val="19"/>
+              </w:rPr>
+              <w:t>J: Skills Dictionary</w:t>
+            </w:r>
+          </w:p>
+        </w:tc>
+        <w:tc>
+          <w:tcPr>
+            <w:tcW w:type="dxa" w:w="1701"/>
+          </w:tcPr>
+          <w:p>
+            <w:r>
+              <w:rPr>
+                <w:sz w:val="19"/>
+              </w:rPr>
+              <w:t>HR + SMEs</w:t>
+            </w:r>
+          </w:p>
+        </w:tc>
+        <w:tc>
+          <w:tcPr>
+            <w:tcW w:type="dxa" w:w="4535"/>
+          </w:tcPr>
+          <w:p>
+            <w:r>
+              <w:rPr>
+                <w:sz w:val="19"/>
+              </w:rPr>
+              <w:t>AI generates, SMEs review over multiple sessions.</w:t>
+            </w:r>
+          </w:p>
+        </w:tc>
+      </w:tr>
+      <w:tr>
+        <w:tc>
+          <w:tcPr>
+            <w:tcW w:type="dxa" w:w="1701"/>
+            <w:shd w:fill="F1F3F6" w:val="clear"/>
+          </w:tcPr>
+          <w:p>
+            <w:r>
+              <w:rPr>
+                <w:sz w:val="19"/>
+              </w:rPr>
+              <w:t>K: Competencies</w:t>
+            </w:r>
+          </w:p>
+        </w:tc>
+        <w:tc>
+          <w:tcPr>
+            <w:tcW w:type="dxa" w:w="1701"/>
+            <w:shd w:fill="F1F3F6" w:val="clear"/>
+          </w:tcPr>
+          <w:p>
+            <w:r>
+              <w:rPr>
+                <w:sz w:val="19"/>
+              </w:rPr>
+              <w:t>HR + L&amp;D team</w:t>
+            </w:r>
+          </w:p>
+        </w:tc>
+        <w:tc>
+          <w:tcPr>
+            <w:tcW w:type="dxa" w:w="4535"/>
+            <w:shd w:fill="F1F3F6" w:val="clear"/>
+          </w:tcPr>
+          <w:p>
+            <w:r>
+              <w:rPr>
+                <w:sz w:val="19"/>
+              </w:rPr>
+              <w:t>Values-linked, needs leadership sign-off.</w:t>
+            </w:r>
+          </w:p>
+        </w:tc>
+      </w:tr>
+      <w:tr>
+        <w:tc>
+          <w:tcPr>
+            <w:tcW w:type="dxa" w:w="1701"/>
+          </w:tcPr>
+          <w:p>
+            <w:r>
+              <w:rPr>
+                <w:sz w:val="19"/>
+              </w:rPr>
+              <w:t>L: Job Roles</w:t>
+            </w:r>
+          </w:p>
+        </w:tc>
+        <w:tc>
+          <w:tcPr>
+            <w:tcW w:type="dxa" w:w="1701"/>
+          </w:tcPr>
+          <w:p>
+            <w:r>
+              <w:rPr>
+                <w:sz w:val="19"/>
+              </w:rPr>
+              <w:t>HR + Department heads</w:t>
+            </w:r>
+          </w:p>
+        </w:tc>
+        <w:tc>
+          <w:tcPr>
+            <w:tcW w:type="dxa" w:w="4535"/>
+          </w:tcPr>
+          <w:p>
+            <w:r>
+              <w:rPr>
+                <w:sz w:val="19"/>
+              </w:rPr>
+              <w:t>Each dept head validates their roles. Longest block.</w:t>
+            </w:r>
+          </w:p>
+        </w:tc>
+      </w:tr>
+    </w:tbl>
+    <w:p>
+      <w:r>
+        <w:t>The save &amp; resume model supports this by allowing each stakeholder to open the relevant block, see what's been filled so far (read-only), edit their section, save, and leave — without affecting other blocks or requiring the entire workflow to be completed in sequence.</w:t>
+      </w:r>
+    </w:p>
+    <w:p>
+      <w:pPr>
+        <w:pStyle w:val="Heading2"/>
+      </w:pPr>
+      <w:r>
+        <w:t>19.8 Dashboard "Last Activity" View</w:t>
+      </w:r>
+    </w:p>
+    <w:p>
+      <w:r>
+        <w:t>The dashboard shows a per-block activity summary to help the admin track progress across stakeholders:</w:t>
+      </w:r>
+    </w:p>
+    <w:p>
+      <w:pPr>
+        <w:pStyle w:val="ListBullet"/>
+        <w:ind w:left="680"/>
+      </w:pPr>
+      <w:r>
+        <w:rPr>
+          <w:sz w:val="20"/>
+        </w:rPr>
+        <w:t>Each block card shows: status icon, item counts, "Last saved by [name] on [date]"</w:t>
+      </w:r>
+    </w:p>
+    <w:p>
+      <w:pPr>
+        <w:pStyle w:val="ListBullet"/>
+        <w:ind w:left="680"/>
+      </w:pPr>
+      <w:r>
+        <w:rPr>
+          <w:sz w:val="20"/>
+        </w:rPr>
+        <w:t>A small timeline/activity log at the bottom of the dashboard: "Apr 2: Kavitha saved Block A · Apr 2: Rajesh updated Block G (3 tools added) · Apr 1: Strategy deck uploaded to Block C"</w:t>
+      </w:r>
+    </w:p>
+    <w:p>
+      <w:pPr>
+        <w:pStyle w:val="ListBullet"/>
+        <w:ind w:left="680"/>
+      </w:pPr>
+      <w:r>
+        <w:rPr>
+          <w:sz w:val="20"/>
+        </w:rPr>
+        <w:t>Overall progress: "8 of 12 blocks · 67% complete · Last activity: 2 hours ago"</w:t>
+      </w:r>
+    </w:p>
+    <w:p>
+      <w:r>
+        <w:br w:type="page"/>
       </w:r>
     </w:p>
     <w:p/>

</xml_diff>